<commit_message>
Add clickable JSON hypermedia request links
Render HTTP and HTTPS values in formatted JSON responses as accessible links that open unique GET request tabs without automatically sending them.

Copy authorization settings only for same-origin targets, reject unsafe or ambiguous URLs explicitly, and preserve request isolation.

Add unit and cross-browser workflow coverage, update help content and human test guidance, and regenerate the authoritative Word documentation.

dev: jhaynes
</commit_message>
<xml_diff>
--- a/documentation/word/Relay-Studio-Security-Platform-and-Release-Manual.docx
+++ b/documentation/word/Relay-Studio-Security-Platform-and-Release-Manual.docx
@@ -346,6 +346,16 @@
       </w:pPr>
       <w:r>
         <w:t>Native HTTP follows only same-origin redirects, rejects cross-origin replay before headers can move, returns final identity, and stops redirect loops after 10 requests.</w:t>
+      </w:r>
+    </w:p>
+    <w:p>
+      <w:pPr>
+        <w:pStyle w:val="ListBullet"/>
+        <w:spacing w:after="80"/>
+        <w:ind w:left="540" w:hanging="271"/>
+      </w:pPr>
+      <w:r>
+        <w:t>Formatted JSON response links copy authorization only to an exact same-origin GET request; cross-origin, credential-bearing, duplicate-query, and non-HTTP destinations fail before project mutation.</w:t>
       </w:r>
     </w:p>
     <w:p>

</xml_diff>

<commit_message>
Harden live REST release gates dev: jhaynes
</commit_message>
<xml_diff>
--- a/documentation/word/Relay-Studio-Security-Platform-and-Release-Manual.docx
+++ b/documentation/word/Relay-Studio-Security-Platform-and-Release-Manual.docx
@@ -458,7 +458,7 @@
     </w:p>
     <w:p>
       <w:r>
-        <w:t>PR and main Release Gates run deterministic quality and security validation. When live REST configuration is missing they report the omission without making ordinary CI permanently red. Beta-tag and manual Package Beta runs require the protected live configuration and complete acceptance before the platform matrix starts.</w:t>
+        <w:t>PR and main Release Gates run deterministic quality and security validation without materializing protected live REST configuration or contacting an external fixture. Beta-tag and manual Package Beta runs require the protected live configuration and complete acceptance before the platform matrix starts.</w:t>
       </w:r>
     </w:p>
     <w:p>
@@ -896,7 +896,7 @@
         <w:ind w:left="540" w:hanging="271"/>
       </w:pPr>
       <w:r>
-        <w:t>Web, Rust, security, and configured live REST gates pass.</w:t>
+        <w:t>Web, Rust, and security gates pass; configured live REST acceptance passes when beta packaging is in scope.</w:t>
       </w:r>
     </w:p>
     <w:p>

</xml_diff>